<commit_message>
Approve Rebounding Arc Blade governance and reconcile Frost acceptance
Record Manny's approved amendment 2.15 / ADR-076 and bounded Arc scope. Synchronize the Word approval artifact with approved amendments 2.3–2.15 as required by PRD section 31.3. Documentation only; Arc gameplay remains pending.
</commit_message>
<xml_diff>
--- a/docs/Manacondas_Minigame_Mayhem_PRD_v1.1.docx
+++ b/docs/Manacondas_Minigame_Mayhem_PRD_v1.1.docx
@@ -25211,6 +25211,507 @@
       </w:pPr>
       <w:r>
         <w:t>End of PRD v1.1</w:t>
+      </w:r>
+    </w:p>
+    <w:p>
+      <w:r>
+        <w:br w:type="page"/>
+      </w:r>
+    </w:p>
+    <w:p>
+      <w:pPr>
+        <w:pStyle w:val="AmendmentHeading"/>
+      </w:pPr>
+      <w:r>
+        <w:t>Approved item implementation amendments</w:t>
+      </w:r>
+    </w:p>
+    <w:p>
+      <w:pPr>
+        <w:pStyle w:val="AmendmentBody"/>
+      </w:pPr>
+      <w:r>
+        <w:t>This appendix records the approved working PRD amendments 2.3 through 2.15. They supersede corresponding earlier baseline clauses. Amendment 2.15 records Manny's September 11, 2026 approval of Rebounding Arc Blade scope and governance publication. Gameplay implementation and live acceptance remain subsequent gates. The canonical working text and the referenced scope documents are maintained in docs/PRD.md in Manaconda33/manacondas-minigame-mayhem.</w:t>
+      </w:r>
+    </w:p>
+    <w:p>
+      <w:pPr>
+        <w:pStyle w:val="AmendmentHeading"/>
+      </w:pPr>
+      <w:r>
+        <w:t>Amendment 2.3 Nitro Surge live balance tuning</w:t>
+      </w:r>
+    </w:p>
+    <w:p>
+      <w:pPr>
+        <w:pStyle w:val="AmendmentBody"/>
+      </w:pPr>
+      <w:r>
+        <w:t>Approved September 6, 2026 after the first deterministic deployed Nitro Surge acceptance pass. Product-owner testing confirmed the item activation, consumption, inventory release, HUD/VFX tell, off-road override, pause safety, expiry cleanup, desktop/mobile input, deterministic test harness, and normal-selector isolation. Acceleration was functional but not sufficiently pronounced, and the approximately 1.2-second active window felt too short to provide a satisfying or useful boost.</w:t>
+      </w:r>
+    </w:p>
+    <w:p>
+      <w:pPr>
+        <w:pStyle w:val="AmendmentBody"/>
+      </w:pPr>
+      <w:r>
+        <w:t>Nitro Surge duration is therefore changed from approximately 1.2 seconds to approximately 2.4 seconds, and its acceleration multiplier is changed from 1.35x to 1.50x. The approved 1.18x normal speed cap remains unchanged. The off-road speed-penalty override, Traction-governed off-road acceleration, one-charge inventory behavior, pause-safe timer, VFX lifetime coupling, and clean restoration remain unchanged. These values supersede conflicting Nitro Surge duration/acceleration values in the baseline PRD and Slice 5 design while leaving every other item unchanged. This amendment was explicitly approved by Manny before implementation.</w:t>
+      </w:r>
+    </w:p>
+    <w:p>
+      <w:pPr>
+        <w:pStyle w:val="AmendmentHeading"/>
+      </w:pPr>
+      <w:r>
+        <w:t>Amendment 2.4 Kinetic Disc guardrails and perspective-correct spinout</w:t>
+      </w:r>
+    </w:p>
+    <w:p>
+      <w:pPr>
+        <w:pStyle w:val="AmendmentBody"/>
+      </w:pPr>
+      <w:r>
+        <w:t>Approved September 6, 2026 before the Kinetic Disc implementation checkpoint. The Ricochet Kinetic Disc retains its existing governed projectile values: forward/backward unguided launch, approximately 28 m/s plus limited inherited velocity, approximately 0.32 m radius, nine-second maximum lifetime, up to three wall ricochets using the contact normal, standard approximately 0.85-second spinout on racer impact, and destruction on racer hit.</w:t>
+      </w:r>
+    </w:p>
+    <w:p>
+      <w:pPr>
+        <w:pStyle w:val="AmendmentBody"/>
+      </w:pPr>
+      <w:r>
+        <w:t>Circuit Alpha adds continuous visible guardrails outside the legal road/shoulder racing corridor. These rails are a shared collision boundary for Kinetic Disc ricochets and racers. Racer contact with a guardrail produces bounded inward reflection and speed loss plus a brief existing hit-art reaction; guardrail contact alone does not apply the Kinetic Disc standard spinout. The guardrails do not change the circuit centerline, checkpoints, lap validation, item-box rows, or approved dirt/boost/ramp surfaces.</w:t>
+      </w:r>
+    </w:p>
+    <w:p>
+      <w:pPr>
+        <w:pStyle w:val="AmendmentBody"/>
+      </w:pPr>
+      <w:r>
+        <w:t>A Kinetic Disc racer hit applies one visible full-yaw spin over the governed standard spinout window. Player controls are suppressed while that spinout is active and planar momentum decays without teleporting the kart. To make the spin readable, the chase/rear camera holds the player's pre-impact travel heading for the spinout rather than orbiting with the rotating kart. The kart's actual orientation still drives 2D driver-facing selection every frame, so the existing approved hit and front-hit assets switch according to whether the camera currently sees the driver's rear or front as the kart rotates. The same facing rule applies to AI racers visible from either player camera. No new character raster art is authorized or required by this amendment.</w:t>
+      </w:r>
+    </w:p>
+    <w:p>
+      <w:pPr>
+        <w:pStyle w:val="AmendmentHeading"/>
+      </w:pPr>
+      <w:r>
+        <w:t>Amendment 2.5 Kinetic Disc catch-up speed</w:t>
+      </w:r>
+    </w:p>
+    <w:p>
+      <w:pPr>
+        <w:pStyle w:val="AmendmentBody"/>
+      </w:pPr>
+      <w:r>
+        <w:t>Approved September 6, 2026 after PR #104 live testing. Raise Ricochet Kinetic Disc base speed from approximately 28 m/s to 42 m/s so it can close on full-speed racers. Preserve the existing bounded inherited velocity: add 0.35 times the owner's planar velocity after clamping that velocity to 8 m/s, yielding approximately 44.8 m/s for a straight forward shot from a fast-moving kart. This supersedes the Kinetic speed in amendment 2.4 and prior baseline references.</w:t>
+      </w:r>
+    </w:p>
+    <w:p>
+      <w:pPr>
+        <w:pStyle w:val="AmendmentBody"/>
+      </w:pPr>
+      <w:r>
+        <w:t>Retain the existing angle-of-incidence reflection, with projectile speed preserved across ricochets. A shallow shot on a curved section may hit the same rail again; there is no forced opposite-rail trajectory, minimum inward angle, or homing. The 0.32 m radius, nine-second lifetime, three-ricochet limit, owner arming/self-hit rules, one-charge successful-spawn consumption, 40-projectile cap, and 0.85-second spinout/camera/sprite contract remain unchanged. Final acceptance, September 6, 2026: PR #105 merged at 1497672c639adaf6ca71f2aa775d4e0c23572b33; CI/Pages run 34034999554 passed, and Manny explicitly live accepted the 42 m/s speed, angle-based ricochets, spinout, chase/rear perspective, and normal item selection. This closes the corrective gate. Issue #106 is a separate future-development standings-display defect and is not an acceptance blocker. The next bounded Seeker proposal is documented separately; no Seeker tuning amendment is approved by this acceptance record. Slice 6 remains locked.</w:t>
+      </w:r>
+    </w:p>
+    <w:p>
+      <w:pPr>
+        <w:pStyle w:val="AmendmentHeading"/>
+      </w:pPr>
+      <w:r>
+        <w:t>Amendment 2.6 Homing Seeker Drone</w:t>
+      </w:r>
+    </w:p>
+    <w:p>
+      <w:pPr>
+        <w:pStyle w:val="AmendmentBody"/>
+      </w:pPr>
+      <w:r>
+        <w:t>Manny approved merging PR #107 and implementing docs/SLICE-5-SEEKER-DRONE-SCOPE.md on September 6, 2026. Seeker launches forward, locks the nearest unfinished rival strictly ahead by validated total race progress, and retains its charge on failed activation. Normal selection filters it when no target is ahead. Rank changes do not retarget; target finish/removal expires the drone. It starts at 42 m/s, approaches clamp(target planar speed + 10, 42, 56) m/s with at most 20 m/s² speed change, and receives no inherited launch velocity. It retains 0.5-second arming, 12-second total lifetime, and 120-degree/second maximum turning. Guidance physically follows the shared legal track route; no position/heading snap or teleport is permitted. Radius is 0.32 m. Guardrail contact destroys it without a bounce; armed racer interception, including later owner self-hit, destroys it and applies the accepted 0.85-second spinout. No racer damage occurs before arming. Warning marker/HUD and settings-aware synthesized tone escalate at estimated arrival thresholds of three and one seconds. Pause, target loss, hit, expiry, and disposal clean up warnings. The existing 40-projectile cap is shared. An opt-in marked incoming-Seeker fixture is authorized for live warning/impact acceptance, without enabling general AI tactics. Issue #106 remains deferred. Gameplay merge/deployment and live acceptance remain separately gated; Slice 6 remains locked.</w:t>
+      </w:r>
+    </w:p>
+    <w:p>
+      <w:pPr>
+        <w:pStyle w:val="AmendmentHeading"/>
+      </w:pPr>
+      <w:r>
+        <w:t>Amendment 2.7 Apex Orbital Missile core</w:t>
+      </w:r>
+    </w:p>
+    <w:p>
+      <w:pPr>
+        <w:pStyle w:val="AmendmentBody"/>
+      </w:pPr>
+      <w:r>
+        <w:t>Approved September 7, 2026. Manny approved merging PR #110 and implementing the complete docs/SLICE-5-APEX-MISSILE-SCOPE.md proposal. Preserve section 15.5 / ITEM-007: current unfinished leader at terminal lock, 2.5-second warning, 5.5 m horizontal AoE, 1.20-second heavy spin, one active globally, and at least 18 race seconds between actual successful launches. Approved fill-ins: 0.6 s vertical rise to 24 m above track; 96 m/s bounded sky travel and overhead tracking; 1 m sky arrival; 10 s sky timeout / 15 s total maximum; 1.9 s overhead warning then 0.6 s terminal dive with 60 m/s horizontal tracking. Lock identity at warning start; before lock follow leader changes, after lock cancel on target finish/loss. Owner can become the leader and receive the blast; ordinary unfinished collateral racers also receive the heavy spin once, with no added impulse or multiplier. Dive ignores ordinary racer/rail contacts and blasts at its actual endpoint.</w:t>
+      </w:r>
+    </w:p>
+    <w:p>
+      <w:pPr>
+        <w:pStyle w:val="AmendmentBody"/>
+      </w:pPr>
+      <w:r>
+        <w:t>Use atomic launch/charge commit and reserve one shared projectile slot for the full lifecycle. Held inventory does not reserve the active Apex slot; failed activation keeps its charge. Only successful launch starts the global cooldown; removal retains that timestamp; pause freezes it and new race resets it. Generic per-racer immunity blocks blast effects. Shockwave may clear only a diving missile within its 5 m 3D radius, before missile movement/blast in that simulation step. The marked incoming fixture uses normal leader targeting and the same global launch gate. This core increment tests counter boundaries without implementing playable Shockwave/Prismatic; real cross-item and live counter gates remain outstanding. General AI tactics, issue #106, and Slice 6 remain deferred. All other accepted gameplay and probability weights remain unchanged.</w:t>
+      </w:r>
+    </w:p>
+    <w:p>
+      <w:pPr>
+        <w:pStyle w:val="AmendmentHeading"/>
+      </w:pPr>
+      <w:r>
+        <w:t>Amendment 2.8 HazardSystem and Timed Blast Orb</w:t>
+      </w:r>
+    </w:p>
+    <w:p>
+      <w:pPr>
+        <w:pStyle w:val="AmendmentBody"/>
+      </w:pPr>
+      <w:r>
+        <w:t>Approved September 7, 2026. Manny approved the complete bounded docs/SLICE-5-BLAST-ORB-SCOPE.md proposal. Preserve section 15.6 and the approved Slice 5 item-system contract: Timed Blast Orb remains a one-charge forward/backward deployable hazard with an approximately 3.0-second fuse, 4.0 m horizontal blast radius, qualifying early direct-impact detonation, and the approved 1.20-second heavy explosive spinout. Normal rank probabilities remain unchanged.</w:t>
+      </w:r>
+    </w:p>
+    <w:p>
+      <w:pPr>
+        <w:pStyle w:val="AmendmentBody"/>
+      </w:pPr>
+      <w:r>
+        <w:t>The approved implementation establishes HazardSystem as the owner of Blast Orb state, movement, fuse, collision checks, detonation, rendering, counter removal, and cleanup. Item-physics capacity becomes one shared maximum of 40 active/reserved projectile + hazard objects; Kinetic Disc, Seeker Drone, Apex reservations, and Blast Orb each consume one slot for their active lifecycle, and a full-capacity activation must preserve the held charge. Forward deployment spawns approximately 1.75 m ahead at 14 m/s base planar speed plus 0.35x inherited planar owner velocity capped at 12 m/s. Backward deployment spawns approximately 1.75 m behind with 0.20x inherited planar owner velocity capped at 12 m/s. Both use deterministic 6 m/s² planar drag. Guardrails contain the ground-bound orb and remove outward velocity without detonating it.</w:t>
+      </w:r>
+    </w:p>
+    <w:p>
+      <w:pPr>
+        <w:pStyle w:val="AmendmentBody"/>
+      </w:pPr>
+      <w:r>
+        <w:t>Owner immunity lasts 0.35 s. Other racers may trigger a qualifying early detonation during that window, but the owner is excluded from that blast until immunity expires; later armed self-hit/self-blast is legal. Direct racer contact triggers early detonation only at at least 8 m/s planar relative closing speed. Fuse time is race-simulation time and freezes under pause. On each simulation step, queued Shockwave-clear queries resolve before movement/contact and fuse detonation. Blast resolution reuses the generic horizontal area-effect/immunity boundary, applies no extra impulse/damage/speed multiplier, and affects each eligible unfinished racer at most once.</w:t>
+      </w:r>
+    </w:p>
+    <w:p>
+      <w:pPr>
+        <w:pStyle w:val="AmendmentBody"/>
+      </w:pPr>
+      <w:r>
+        <w:t>The reusable hazard counter boundary may remove Blast Orbs within the approved 5 m Shockwave radius, but playable Shockwave and real cross-item counter acceptance remain deferred. AI Blast-Orb/Slick avoidance is also deferred until both shared hazard classes exist. The marked incoming Blast Orb fixture is opt-in and must not consume AI inventory or alter normal item distribution. Issue #106, Slick, Prismatic, general AI item tactics, accepted Nitro/Kinetic/Seeker/Apex behavior, racer stats, track/checkpoint authority, character assets, and Slice 6 remain unchanged/deferred.</w:t>
+      </w:r>
+    </w:p>
+    <w:p>
+      <w:pPr>
+        <w:pStyle w:val="AmendmentHeading"/>
+      </w:pPr>
+      <w:r>
+        <w:t>Amendment 2.9 Slick Trap hazard behavior</w:t>
+      </w:r>
+    </w:p>
+    <w:p>
+      <w:pPr>
+        <w:pStyle w:val="AmendmentBody"/>
+      </w:pPr>
+      <w:r>
+        <w:t>Approved September 7, 2026 before Slick Trap gameplay implementation. The existing Slice 5 roster, rank probabilities, one-slot inventory, accepted Nitro/Kinetic/Seeker/Apex/Blast behavior, track/checkpoint authority, racer statistics, and Slice 6 lock remain unchanged. docs/SLICE-5-SLICK-TRAP-SCOPE.md and ADR-070 are normative for this bounded increment.</w:t>
+      </w:r>
+    </w:p>
+    <w:p>
+      <w:pPr>
+        <w:pStyle w:val="AmendmentBody"/>
+      </w:pPr>
+      <w:r>
+        <w:t>Slick Trap is one charge and extends the accepted HazardSystem. It is rear-only: either forward ITEM intent or Brake/Reverse + ITEM places one stationary Slick approximately 1.75 m behind the kart at track elevation with no inherited planar velocity. Guardrail overlap receives only minimum inward penetration correction. Each active Slick consumes one slot from the accepted shared maximum of 40 active/reserved projectile + hazard objects; capacity failure preserves the held charge.</w:t>
+      </w:r>
+    </w:p>
+    <w:p>
+      <w:pPr>
+        <w:pStyle w:val="AmendmentBody"/>
+      </w:pPr>
+      <w:r>
+        <w:t>A Slick lives for 12 race seconds and freezes under pause. The owner is immune for 0.35 race seconds while other unfinished racers may trigger immediately. After arming, ordinary later owner self-trigger is legal. An unfinished, non-immune racer triggers at planar center distance &lt;= 1.1 m with no closing-speed threshold. The Slick is removed before effect resolution so one placement resolves once. Generic item immunity suppresses the trigger/effect and leaves the Slick in place.</w:t>
+      </w:r>
+    </w:p>
+    <w:p>
+      <w:pPr>
+        <w:pStyle w:val="AmendmentBody"/>
+      </w:pPr>
+      <w:r>
+        <w:t>A valid trigger retains 60% of the racer's current planar velocity without increasing near-stationary speed, applies one 360-degree yaw presentation over 0.85 race seconds, suppresses player drive controls for that presentation, and reuses the accepted perspective-correct hostile-hit camera/driver-state boundary. Do not add the standard/heavy spinout momentum-decay curve, extra impulse, damage, or stacked yaw rate.</w:t>
+      </w:r>
+    </w:p>
+    <w:p>
+      <w:pPr>
+        <w:pStyle w:val="AmendmentBody"/>
+      </w:pPr>
+      <w:r>
+        <w:t>Each owner may have at most two active Slicks. A successful third deployment atomically retires that owner's oldest Slick and replaces it with the new placement; a failed new use preserves the held charge and both existing Slicks. The existing queued hazard-clear boundary applies generically to Slick and Blast Orb and resolves before Slick trigger processing in the same simulation step. Synthetic Shockwave evidence uses the existing approximately 5 m clear radius; playable Shockwave remains deferred.</w:t>
+      </w:r>
+    </w:p>
+    <w:p>
+      <w:pPr>
+        <w:pStyle w:val="AmendmentBody"/>
+      </w:pPr>
+      <w:r>
+        <w:t>Targeted acceptance reuses ?testItem=slick-trap and adds opt-in ?testSlickAhead=1, which places one fixture-owned Slick approximately 8 m ahead after five race seconds without consuming AI inventory or enabling AI tactics/avoidance. AI avoidance for both Blast Orb and Slick remains deferred until Slick itself is live accepted, at which point the shared hazard-response increment is separately approval-gated. Gameplay implementation, publication/deployment, and live acceptance remain separate gates.</w:t>
+      </w:r>
+    </w:p>
+    <w:p>
+      <w:pPr>
+        <w:pStyle w:val="AmendmentHeading"/>
+      </w:pPr>
+      <w:r>
+        <w:t>Amendment 2.10 AI hazard response for Slick Trap and Timed Blast Orb</w:t>
+      </w:r>
+    </w:p>
+    <w:p>
+      <w:pPr>
+        <w:pStyle w:val="AmendmentBody"/>
+      </w:pPr>
+      <w:r>
+        <w:t>Approved September 7, 2026 after live acceptance of both Timed Blast Orb and Slick Trap. This amendment fills the previously unspecified operating details for the existing Section 21.5 AI obstacle-avoidance requirement without enabling AI item acquisition/use, changing accepted hazard physics, altering item probabilities, changing racer statistics, or beginning Slice 6. docs/SLICE-5-AI-HAZARD-RESPONSE-SCOPE.md and ADR-071 are normative for this bounded increment.</w:t>
+      </w:r>
+    </w:p>
+    <w:p>
+      <w:pPr>
+        <w:pStyle w:val="AmendmentBody"/>
+      </w:pPr>
+      <w:r>
+        <w:t>AI hazard awareness consumes read-only Slick Trap and Timed Blast Orb snapshots and reasons by wrapped forward route distance on Circuit Alpha. Relevant hazards are considered up to 20 m ahead. The existing five bounded lane candidates remain authoritative. AI planning treats Slick as conflicted inside a 2.5 m planning footprint and Blast Orb inside a 4.5 m planning footprint; these are decision margins only and do not change the governed Slick trigger or Blast radius. Moving Blast Orbs are evaluated at their current position plus a 0.5 s drag-aware prediction capped by remaining fuse time.</w:t>
+      </w:r>
+    </w:p>
+    <w:p>
+      <w:pPr>
+        <w:pStyle w:val="AmendmentBody"/>
+      </w:pPr>
+      <w:r>
+        <w:t>Hazard clearance takes precedence over preferred-lane convenience while existing nearby-racer avoidance remains active where possible. If every candidate lane is conflicted, AI chooses the candidate with greatest minimum clearance rather than receiving guaranteed immunity. After the last relevant hazard clears or moves behind, AI holds the avoidance lane for at least 0.6 race seconds before normal preferred-lane recovery. All lateral motion continues through existing steering dynamics: no teleport, transform snap, hidden speed boost, speed penalty, emergency brake rule, rubber-band change, or lap/checkpoint mutation is authorized.</w:t>
+      </w:r>
+    </w:p>
+    <w:p>
+      <w:pPr>
+        <w:pStyle w:val="AmendmentBody"/>
+      </w:pPr>
+      <w:r>
+        <w:t>Awareness timers advance only with race simulation, so pause freezes the clear-hold. Removed/expired hazards disappear from awareness on the next simulation step; restart, return-to-hub, and disposal clear temporary avoidance state. Deterministic acceptance instrumentation may use ?testAiHazardAvoidance=slick and ?testAiHazardAvoidance=blast to place a real accepted hazard approximately 12 m ahead of the first unfinished AI after five race seconds without consuming AI inventory or enabling AI item tactics. Gameplay implementation, publication/deployment, and live acceptance remain separately gated.</w:t>
+      </w:r>
+    </w:p>
+    <w:p>
+      <w:pPr>
+        <w:pStyle w:val="AmendmentHeading"/>
+      </w:pPr>
+      <w:r>
+        <w:t>Amendment 2.11 Acoustic Shockwave Pulse counter behavior</w:t>
+      </w:r>
+    </w:p>
+    <w:p>
+      <w:pPr>
+        <w:pStyle w:val="AmendmentBody"/>
+      </w:pPr>
+      <w:r>
+        <w:t>Approved September 7, 2026 before Shockwave gameplay implementation. This amendment fills the operating details for the existing Section 15.12 Acoustic Shockwave Pulse without changing its approximately 5 m radial-defense identity, the fifteen-item probability matrix, one-slot inventory, racer statistics, track/checkpoint authority, accepted item behavior, or the Slice 6 lock. docs/SLICE-5-SHOCKWAVE-SCOPE.md and ADR-072 are normative for this bounded increment.</w:t>
+      </w:r>
+    </w:p>
+    <w:p>
+      <w:pPr>
+        <w:pStyle w:val="AmendmentBody"/>
+      </w:pPr>
+      <w:r>
+        <w:t>Shockwave is a one-charge instantaneous pulse centered on the using kart. Forward and backward ITEM intent are equivalent. A successful activation consumes its charge when the pulse is committed even if no target is inside the radius. Shockwave itself is not a persistent projectile/hazard and does not reserve a shared item-physics-capacity slot. The readable expanding pressure-ring presentation is gameplay VFX only; final production VFX/audio remains Slice 6.</w:t>
+      </w:r>
+    </w:p>
+    <w:p>
+      <w:pPr>
+        <w:pStyle w:val="AmendmentBody"/>
+      </w:pPr>
+      <w:r>
+        <w:t>Eligible unfinished, non-owner, non-immune racers at horizontal center distance &lt;= 5.0 m receive no conventional spinout, damage, teleport, or transform snap. Instead the pulse adds one outward planar velocity delta with magnitude linearly interpolated from 6.0 m/s at zero distance to 2.0 m/s at 5.0 m. A deterministic finite fallback direction is required for coincident centers. The effect may not edit lap/checkpoint/rank/finish authority.</w:t>
+      </w:r>
+    </w:p>
+    <w:p>
+      <w:pPr>
+        <w:pStyle w:val="AmendmentBody"/>
+      </w:pPr>
+      <w:r>
+        <w:t>Within the same 5.0 m horizontal radius, ordinary active Ricochet Kinetic Disc and Homing Seeker Drone projectiles are destroyed regardless of their owner-arming state. Slick Trap and Timed Blast Orb hazards are cleared through the accepted queued HazardSystem counter boundary. The existing Apex counter remains 3D: only a missile already in its terminal/dive state may be neutralized inside 5.0 m; rise, sky-travel, and warning/overhead phases are not counterable. Counter queries must resolve before affected projectile/hazard/Apex movement, contact, fuse, or blast processing in that simulation step so a correctly timed pulse wins the frame.</w:t>
+      </w:r>
+    </w:p>
+    <w:p>
+      <w:pPr>
+        <w:pStyle w:val="AmendmentBody"/>
+      </w:pPr>
+      <w:r>
+        <w:t>No AI item acquisition/use is enabled by this increment. The player-only ?testItem=shockwave override and bounded ?testShockwaveCounter=&lt;case&gt; acceptance fixtures may exercise racer, Kinetic, Seeker, Slick, Blast, and terminal-Apex cases without altering normal distribution or AI tactics. Pause/restart/disposal must leave no queued pulse or presentation state behind. Gameplay implementation, publication/deployment, and live acceptance remain separately gated.</w:t>
+      </w:r>
+    </w:p>
+    <w:p>
+      <w:pPr>
+        <w:pStyle w:val="AmendmentHeading"/>
+      </w:pPr>
+      <w:r>
+        <w:t>Amendment 2.12 Prismatic Invincibility</w:t>
+      </w:r>
+    </w:p>
+    <w:p>
+      <w:pPr>
+        <w:pStyle w:val="AmendmentBody"/>
+      </w:pPr>
+      <w:r>
+        <w:t>Approved September 9, 2026, including Manny's explicit clarification that Prismatic prevents Slick spinout and dirt/grass slowdown. Section 15.17, ADR-073, and docs/SLICE-5-PRISMATIC-INVINCIBILITY-SCOPE.md govern this bounded increment.</w:t>
+      </w:r>
+    </w:p>
+    <w:p>
+      <w:pPr>
+        <w:pStyle w:val="AmendmentBody"/>
+      </w:pPr>
+      <w:r>
+        <w:t>A valid committed one-charge use frees the inventory slot and activates exactly 6.0 race seconds of item immunity, a 1.12x road-based speed cap, and hostile contact. Forward/reverse ITEM are equivalent. A repeat use refreshes duration rather than stacking. Ignore dirt/grass speed-cap, deceleration, and acceleration penalties while active; retain terrain geometry and steering/traction. Use normal acceleration, with no instantaneous speed multiplication or autopilot. Preserve independently timed Nitro and other accepted boosts; combine caps and acceleration by maximum, never multiplication. Activation does not clear an existing spinout or restore lost momentum.</w:t>
+      </w:r>
+    </w:p>
+    <w:p>
+      <w:pPr>
+        <w:pStyle w:val="AmendmentBody"/>
+      </w:pPr>
+      <w:r>
+        <w:t>Valid armed Kinetic/Seeker contacts are absorbed, destroying the projectile without a hostile effect on the protected racer. Protected racers do not trigger or clear Slick and receive no spinout or speed reduction. Blast/Apex keep normal contact/fuse/targeting/explosion resolution, excluding protected victims while still affecting eligible others. Shockwave cannot push protected racers. Ordinary weight-based kart contact and guardrail physics remain active.</w:t>
+      </w:r>
+    </w:p>
+    <w:p>
+      <w:pPr>
+        <w:pStyle w:val="AmendmentBody"/>
+      </w:pPr>
+      <w:r>
+        <w:t>Hostile contact applies one 0.85-second, one-turn standard spin per encounter to an unfinished non-immune rival at the existing planar contact distance &lt; 2.35 m. Sustained overlap cannot repeatedly refresh the spin; separation to &gt;= 2.35 m rearms the pair. Two protected racers cannot spin one another. No additional speed-retention penalty, contact radius, teleport, heading snap, or race-progress mutation is introduced.</w:t>
+      </w:r>
+    </w:p>
+    <w:p>
+      <w:pPr>
+        <w:pStyle w:val="AmendmentBody"/>
+      </w:pPr>
+      <w:r>
+        <w:t>The approved readable presentation is a translucent faceted shell that follows kart/driver through turns and jumps; flowing cyan/violet/pink/gold highlights with a gentle pulse; a short fading particle trail; a brief blocked-item shimmer; a separate active countdown; and an original volume-aware musical layer. The final second fades smoothly without rapid flashing or a full-screen wash. Preserve driver, track, and hazard visibility. Pause freezes the state; expiry removes only this effect's contributions. Finish, recovery/respawn, restart, hub return, and disposal clear it. Drive, contact, and projectile/hazard processing must use a consistent active interval, including exact activation/expiry boundaries.</w:t>
+      </w:r>
+    </w:p>
+    <w:p>
+      <w:pPr>
+        <w:pStyle w:val="AmendmentBody"/>
+      </w:pPr>
+      <w:r>
+        <w:t>The approved scope specifies fixed-item, held-ready, protected/expired acceptance fixtures with visible stages and verified encounters. The query names are not deployed until gameplay publication. No probability, accepted item balance, racer-stat, track/checkpoint, dependency, AI acquisition/use, or Slice 6 change is authorized. Governance publication, gameplay publication, and product-owner live acceptance retain their separate gates.</w:t>
+      </w:r>
+    </w:p>
+    <w:p>
+      <w:pPr>
+        <w:pStyle w:val="AmendmentHeading"/>
+      </w:pPr>
+      <w:r>
+        <w:t>Amendment 2.13 Blaze Orbs</w:t>
+      </w:r>
+    </w:p>
+    <w:p>
+      <w:pPr>
+        <w:pStyle w:val="AmendmentBody"/>
+      </w:pPr>
+      <w:r>
+        <w:t>Manny approved the complete Blaze Orbs scope in Work following Prismatic live acceptance. Section 15.7, ADR-074, and docs/SLICE-5-BLAZE-ORBS-SCOPE.md are normative. Preserve five charges, at least 0.55 race seconds between committed shots, and a 0.55-second short spin per valid hit.</w:t>
+      </w:r>
+    </w:p>
+    <w:p>
+      <w:pPr>
+        <w:pStyle w:val="AmendmentBody"/>
+      </w:pPr>
+      <w:r>
+        <w:t>Each ITEM press launches one straight planar orb forward, or backward with Brake/Reverse. No automatic fire or target requirement. Use 42 m/s with no inherited kart velocity, 0.28 m radius, a 3.0-second lifetime, zero wall bounces, and 0.18-second owner immunity. Use the shared launch offset of 1.75 m plus radius, shared projectile height/terrain conventions, and existing 1.05 m racer collision radius. Other racers can be hit during owner arming; later normal contact may hit the owner. Destroy on first guardrail or valid racer contact. No splash, burning, extra speed-retention penalty, or damage-over-time. Repeated hits refresh the accepted short spin, without adding duration or spin rates.</w:t>
+      </w:r>
+    </w:p>
+    <w:p>
+      <w:pPr>
+        <w:pStyle w:val="AmendmentBody"/>
+      </w:pPr>
+      <w:r>
+        <w:t>The first shot is immediately eligible; only a committed shot spends a charge and starts cadence. Rejection or full shared capacity retains the charge; failed transactions release reservations. The fifth shot frees the slot. Each orb uses one existing shared 40-object slot. Pause freezes cadence, movement, arming, and lifetime. Fired orbs retain ordinary projectile lifetime after owner finish; restart/disposal cleans all owned state.</w:t>
+      </w:r>
+    </w:p>
+    <w:p>
+      <w:pPr>
+        <w:pStyle w:val="AmendmentBody"/>
+      </w:pPr>
+      <w:r>
+        <w:t>Prismatic or another active generic immunity source absorbs valid contact without hostile spin or hit sprite and releases projectile capacity. Shockwave destroys Blaze within its existing &lt;=5 m horizontal counter radius before same-step movement/contact. Preserve accepted immunity timing and target snapshot refresh.</w:t>
+      </w:r>
+    </w:p>
+    <w:p>
+      <w:pPr>
+        <w:pStyle w:val="AmendmentBody"/>
+      </w:pPr>
+      <w:r>
+        <w:t>Use an original amber-orange energy orb, hot core, short ember trail, finite sparks and short gesture/volume/pause-safe audio with bounded resources and both-camera readability. Approved fixed-item hit, Shockwave counter, and Prismatic protected/expired fixtures must report actual verified encounters; misses/interceptions do not count as success. Full details and test gates are in the scope and TESTING.md.</w:t>
+      </w:r>
+    </w:p>
+    <w:p>
+      <w:pPr>
+        <w:pStyle w:val="AmendmentBody"/>
+      </w:pPr>
+      <w:r>
+        <w:t>No other item tuning, probabilities, racer stats, race authority, dependencies, AI item tactics, or Slice 6 expansion is authorized. Governance publication, gameplay publication, and live acceptance remain separate gates.</w:t>
+      </w:r>
+    </w:p>
+    <w:p>
+      <w:pPr>
+        <w:pStyle w:val="AmendmentHeading"/>
+      </w:pPr>
+      <w:r>
+        <w:t>Amendment 2.14 Frost Orbs stacked momentum and handling impairment</w:t>
+      </w:r>
+    </w:p>
+    <w:p>
+      <w:pPr>
+        <w:pStyle w:val="AmendmentBody"/>
+      </w:pPr>
+      <w:r>
+        <w:t>Manny approved the complete Frost Orbs scope in Work following Blaze live acceptance. Section 15.8, ADR-075, and docs/SLICE-5-FROST-ORBS-SCOPE.md are normative. Preserve three charges and the existing ordinary-projectile/inventory, Prismatic, Shockwave, race-authority, AI, dependency, and Slice 6 boundaries.</w:t>
+      </w:r>
+    </w:p>
+    <w:p>
+      <w:pPr>
+        <w:pStyle w:val="AmendmentBody"/>
+      </w:pPr>
+      <w:r>
+        <w:t>A valid Frost hit multiplies the affected racer's current planar X/Z velocity by 0.55 and applies one 0.80 steering-authority multiplier for 1.2 race seconds. Each subsequent valid hit while Frost is active adds another stack, multiplies the current planar X/Z velocity by 0.55 again, applies another 0.80 steering multiplier, and resets the shared 1.2-second timer. All active stacks expire together from the latest hit. Preserve Y velocity, heading, position, race progress, normal acceleration, drift inputs/charge, traction/grip, stats, and AI path decisions. Frost never adds spin, full freeze, extra speed cap, acceleration penalty, or momentum restoration on expiry.</w:t>
+      </w:r>
+    </w:p>
+    <w:p>
+      <w:pPr>
+        <w:pStyle w:val="AmendmentBody"/>
+      </w:pPr>
+      <w:r>
+        <w:t>Use the approved Frost flight, arming, cadence, collision, counter, immunity, lifecycle, presentation, and deterministic-fixture boundaries in the scope document. No other item tuning, probabilities, racer stats, race authority, dependencies, AI item tactics, or Slice 6 work is authorized. Governance publication, gameplay publication, and live acceptance remain separate gates.</w:t>
+      </w:r>
+    </w:p>
+    <w:p>
+      <w:pPr>
+        <w:pStyle w:val="AmendmentHeading"/>
+      </w:pPr>
+      <w:r>
+        <w:t>Amendment 2.15 Rebounding Arc Blade</w:t>
+      </w:r>
+    </w:p>
+    <w:p>
+      <w:pPr>
+        <w:pStyle w:val="AmendmentBody"/>
+      </w:pPr>
+      <w:r>
+        <w:t>Manny approved the complete scope and its governance publication in Work on September 11, 2026, following Frost live acceptance. docs/SLICE-5-ARC-BLADE-SCOPE.md and ADR-076 govern the bounded increment. Preserve section 15.9's three charges, forward curved throw, return to owner, and once-per-rival-per-leg hit limit. Approved fill-ins are 0.55-second cadence, 42 m/s outbound travel, 30 m forward range with a 2 m rightward bow, 56 m/s direct return pursuit, 0.32 m radius, 0.18-second owner arming, and a four-second total lifetime. First guardrail contact destroys the blade; ordinary rival hits use the accepted 0.85-second spin and do not end the flight.</w:t>
+      </w:r>
+    </w:p>
+    <w:p>
+      <w:pPr>
+        <w:pStyle w:val="AmendmentBody"/>
+      </w:pPr>
+      <w:r>
+        <w:t>The approved safe return catch gives no charge refund and explicitly excepts returning Arc owner contact from amendment 2.2's generic self-hit rule. Armed outbound owner contact remains eligible. A phase change during continuous overlap cannot cause a second hit until separation. Owner recovery/finish/removal cancels its blades. Prismatic absorption, Shockwave's &lt;=5 m horizontal clear priority, independent effect ownership, shared capacity, rollback, and normal race authority remain in force.</w:t>
+      </w:r>
+    </w:p>
+    <w:p>
+      <w:pPr>
+        <w:pStyle w:val="AmendmentBody"/>
+      </w:pPr>
+      <w:r>
+        <w:t>The primary test route will force Arc pickups while preserving unrestricted normal-race input. The scope document specifies the exact geometry, lifecycle, presentation and automated/live gates. This governance checkpoint changes no gameplay. No probability, dependency, AI item-use, other item balance or Slice 6 change is authorized. Verify governance merge and CI/Pages before the separately authorized gameplay increment; gameplay publication and live acceptance remain later gates.</w:t>
       </w:r>
     </w:p>
     <w:sectPr>
@@ -37317,6 +37818,34 @@
       <w:sz w:val="16"/>
     </w:rPr>
   </w:style>
+  <w:style w:type="paragraph" w:customStyle="1" w:styleId="AmendmentBody">
+    <w:name w:val="Amendment Body"/>
+    <w:basedOn w:val="Normal"/>
+    <w:pPr>
+      <w:widowControl/>
+      <w:spacing w:after="140" w:line="259" w:lineRule="auto"/>
+    </w:pPr>
+    <w:rPr>
+      <w:rFonts w:ascii="Calibri" w:hAnsi="Calibri"/>
+      <w:color w:val="000000"/>
+      <w:sz w:val="22"/>
+    </w:rPr>
+  </w:style>
+  <w:style w:type="paragraph" w:customStyle="1" w:styleId="AmendmentHeading">
+    <w:name w:val="Amendment Heading"/>
+    <w:basedOn w:val="Normal"/>
+    <w:pPr>
+      <w:keepNext/>
+      <w:widowControl/>
+      <w:spacing w:after="140" w:line="259" w:lineRule="auto" w:before="240"/>
+    </w:pPr>
+    <w:rPr>
+      <w:rFonts w:ascii="Calibri" w:hAnsi="Calibri"/>
+      <w:b/>
+      <w:color w:val="000000"/>
+      <w:sz w:val="26"/>
+    </w:rPr>
+  </w:style>
 </w:styles>
 </file>
 

</xml_diff>

<commit_message>
Approve Rebounding Arc Blade governance and reconcile Frost acceptance (#138)
Record Manny's approved amendment 2.15 / ADR-076 and bounded Arc scope. Synchronize the Word approval artifact with approved amendments 2.3–2.15 as required by PRD section 31.3. Documentation only; Arc gameplay remains pending.
</commit_message>
<xml_diff>
--- a/docs/Manacondas_Minigame_Mayhem_PRD_v1.1.docx
+++ b/docs/Manacondas_Minigame_Mayhem_PRD_v1.1.docx
@@ -25211,6 +25211,507 @@
       </w:pPr>
       <w:r>
         <w:t>End of PRD v1.1</w:t>
+      </w:r>
+    </w:p>
+    <w:p>
+      <w:r>
+        <w:br w:type="page"/>
+      </w:r>
+    </w:p>
+    <w:p>
+      <w:pPr>
+        <w:pStyle w:val="AmendmentHeading"/>
+      </w:pPr>
+      <w:r>
+        <w:t>Approved item implementation amendments</w:t>
+      </w:r>
+    </w:p>
+    <w:p>
+      <w:pPr>
+        <w:pStyle w:val="AmendmentBody"/>
+      </w:pPr>
+      <w:r>
+        <w:t>This appendix records the approved working PRD amendments 2.3 through 2.15. They supersede corresponding earlier baseline clauses. Amendment 2.15 records Manny's September 11, 2026 approval of Rebounding Arc Blade scope and governance publication. Gameplay implementation and live acceptance remain subsequent gates. The canonical working text and the referenced scope documents are maintained in docs/PRD.md in Manaconda33/manacondas-minigame-mayhem.</w:t>
+      </w:r>
+    </w:p>
+    <w:p>
+      <w:pPr>
+        <w:pStyle w:val="AmendmentHeading"/>
+      </w:pPr>
+      <w:r>
+        <w:t>Amendment 2.3 Nitro Surge live balance tuning</w:t>
+      </w:r>
+    </w:p>
+    <w:p>
+      <w:pPr>
+        <w:pStyle w:val="AmendmentBody"/>
+      </w:pPr>
+      <w:r>
+        <w:t>Approved September 6, 2026 after the first deterministic deployed Nitro Surge acceptance pass. Product-owner testing confirmed the item activation, consumption, inventory release, HUD/VFX tell, off-road override, pause safety, expiry cleanup, desktop/mobile input, deterministic test harness, and normal-selector isolation. Acceleration was functional but not sufficiently pronounced, and the approximately 1.2-second active window felt too short to provide a satisfying or useful boost.</w:t>
+      </w:r>
+    </w:p>
+    <w:p>
+      <w:pPr>
+        <w:pStyle w:val="AmendmentBody"/>
+      </w:pPr>
+      <w:r>
+        <w:t>Nitro Surge duration is therefore changed from approximately 1.2 seconds to approximately 2.4 seconds, and its acceleration multiplier is changed from 1.35x to 1.50x. The approved 1.18x normal speed cap remains unchanged. The off-road speed-penalty override, Traction-governed off-road acceleration, one-charge inventory behavior, pause-safe timer, VFX lifetime coupling, and clean restoration remain unchanged. These values supersede conflicting Nitro Surge duration/acceleration values in the baseline PRD and Slice 5 design while leaving every other item unchanged. This amendment was explicitly approved by Manny before implementation.</w:t>
+      </w:r>
+    </w:p>
+    <w:p>
+      <w:pPr>
+        <w:pStyle w:val="AmendmentHeading"/>
+      </w:pPr>
+      <w:r>
+        <w:t>Amendment 2.4 Kinetic Disc guardrails and perspective-correct spinout</w:t>
+      </w:r>
+    </w:p>
+    <w:p>
+      <w:pPr>
+        <w:pStyle w:val="AmendmentBody"/>
+      </w:pPr>
+      <w:r>
+        <w:t>Approved September 6, 2026 before the Kinetic Disc implementation checkpoint. The Ricochet Kinetic Disc retains its existing governed projectile values: forward/backward unguided launch, approximately 28 m/s plus limited inherited velocity, approximately 0.32 m radius, nine-second maximum lifetime, up to three wall ricochets using the contact normal, standard approximately 0.85-second spinout on racer impact, and destruction on racer hit.</w:t>
+      </w:r>
+    </w:p>
+    <w:p>
+      <w:pPr>
+        <w:pStyle w:val="AmendmentBody"/>
+      </w:pPr>
+      <w:r>
+        <w:t>Circuit Alpha adds continuous visible guardrails outside the legal road/shoulder racing corridor. These rails are a shared collision boundary for Kinetic Disc ricochets and racers. Racer contact with a guardrail produces bounded inward reflection and speed loss plus a brief existing hit-art reaction; guardrail contact alone does not apply the Kinetic Disc standard spinout. The guardrails do not change the circuit centerline, checkpoints, lap validation, item-box rows, or approved dirt/boost/ramp surfaces.</w:t>
+      </w:r>
+    </w:p>
+    <w:p>
+      <w:pPr>
+        <w:pStyle w:val="AmendmentBody"/>
+      </w:pPr>
+      <w:r>
+        <w:t>A Kinetic Disc racer hit applies one visible full-yaw spin over the governed standard spinout window. Player controls are suppressed while that spinout is active and planar momentum decays without teleporting the kart. To make the spin readable, the chase/rear camera holds the player's pre-impact travel heading for the spinout rather than orbiting with the rotating kart. The kart's actual orientation still drives 2D driver-facing selection every frame, so the existing approved hit and front-hit assets switch according to whether the camera currently sees the driver's rear or front as the kart rotates. The same facing rule applies to AI racers visible from either player camera. No new character raster art is authorized or required by this amendment.</w:t>
+      </w:r>
+    </w:p>
+    <w:p>
+      <w:pPr>
+        <w:pStyle w:val="AmendmentHeading"/>
+      </w:pPr>
+      <w:r>
+        <w:t>Amendment 2.5 Kinetic Disc catch-up speed</w:t>
+      </w:r>
+    </w:p>
+    <w:p>
+      <w:pPr>
+        <w:pStyle w:val="AmendmentBody"/>
+      </w:pPr>
+      <w:r>
+        <w:t>Approved September 6, 2026 after PR #104 live testing. Raise Ricochet Kinetic Disc base speed from approximately 28 m/s to 42 m/s so it can close on full-speed racers. Preserve the existing bounded inherited velocity: add 0.35 times the owner's planar velocity after clamping that velocity to 8 m/s, yielding approximately 44.8 m/s for a straight forward shot from a fast-moving kart. This supersedes the Kinetic speed in amendment 2.4 and prior baseline references.</w:t>
+      </w:r>
+    </w:p>
+    <w:p>
+      <w:pPr>
+        <w:pStyle w:val="AmendmentBody"/>
+      </w:pPr>
+      <w:r>
+        <w:t>Retain the existing angle-of-incidence reflection, with projectile speed preserved across ricochets. A shallow shot on a curved section may hit the same rail again; there is no forced opposite-rail trajectory, minimum inward angle, or homing. The 0.32 m radius, nine-second lifetime, three-ricochet limit, owner arming/self-hit rules, one-charge successful-spawn consumption, 40-projectile cap, and 0.85-second spinout/camera/sprite contract remain unchanged. Final acceptance, September 6, 2026: PR #105 merged at 1497672c639adaf6ca71f2aa775d4e0c23572b33; CI/Pages run 34034999554 passed, and Manny explicitly live accepted the 42 m/s speed, angle-based ricochets, spinout, chase/rear perspective, and normal item selection. This closes the corrective gate. Issue #106 is a separate future-development standings-display defect and is not an acceptance blocker. The next bounded Seeker proposal is documented separately; no Seeker tuning amendment is approved by this acceptance record. Slice 6 remains locked.</w:t>
+      </w:r>
+    </w:p>
+    <w:p>
+      <w:pPr>
+        <w:pStyle w:val="AmendmentHeading"/>
+      </w:pPr>
+      <w:r>
+        <w:t>Amendment 2.6 Homing Seeker Drone</w:t>
+      </w:r>
+    </w:p>
+    <w:p>
+      <w:pPr>
+        <w:pStyle w:val="AmendmentBody"/>
+      </w:pPr>
+      <w:r>
+        <w:t>Manny approved merging PR #107 and implementing docs/SLICE-5-SEEKER-DRONE-SCOPE.md on September 6, 2026. Seeker launches forward, locks the nearest unfinished rival strictly ahead by validated total race progress, and retains its charge on failed activation. Normal selection filters it when no target is ahead. Rank changes do not retarget; target finish/removal expires the drone. It starts at 42 m/s, approaches clamp(target planar speed + 10, 42, 56) m/s with at most 20 m/s² speed change, and receives no inherited launch velocity. It retains 0.5-second arming, 12-second total lifetime, and 120-degree/second maximum turning. Guidance physically follows the shared legal track route; no position/heading snap or teleport is permitted. Radius is 0.32 m. Guardrail contact destroys it without a bounce; armed racer interception, including later owner self-hit, destroys it and applies the accepted 0.85-second spinout. No racer damage occurs before arming. Warning marker/HUD and settings-aware synthesized tone escalate at estimated arrival thresholds of three and one seconds. Pause, target loss, hit, expiry, and disposal clean up warnings. The existing 40-projectile cap is shared. An opt-in marked incoming-Seeker fixture is authorized for live warning/impact acceptance, without enabling general AI tactics. Issue #106 remains deferred. Gameplay merge/deployment and live acceptance remain separately gated; Slice 6 remains locked.</w:t>
+      </w:r>
+    </w:p>
+    <w:p>
+      <w:pPr>
+        <w:pStyle w:val="AmendmentHeading"/>
+      </w:pPr>
+      <w:r>
+        <w:t>Amendment 2.7 Apex Orbital Missile core</w:t>
+      </w:r>
+    </w:p>
+    <w:p>
+      <w:pPr>
+        <w:pStyle w:val="AmendmentBody"/>
+      </w:pPr>
+      <w:r>
+        <w:t>Approved September 7, 2026. Manny approved merging PR #110 and implementing the complete docs/SLICE-5-APEX-MISSILE-SCOPE.md proposal. Preserve section 15.5 / ITEM-007: current unfinished leader at terminal lock, 2.5-second warning, 5.5 m horizontal AoE, 1.20-second heavy spin, one active globally, and at least 18 race seconds between actual successful launches. Approved fill-ins: 0.6 s vertical rise to 24 m above track; 96 m/s bounded sky travel and overhead tracking; 1 m sky arrival; 10 s sky timeout / 15 s total maximum; 1.9 s overhead warning then 0.6 s terminal dive with 60 m/s horizontal tracking. Lock identity at warning start; before lock follow leader changes, after lock cancel on target finish/loss. Owner can become the leader and receive the blast; ordinary unfinished collateral racers also receive the heavy spin once, with no added impulse or multiplier. Dive ignores ordinary racer/rail contacts and blasts at its actual endpoint.</w:t>
+      </w:r>
+    </w:p>
+    <w:p>
+      <w:pPr>
+        <w:pStyle w:val="AmendmentBody"/>
+      </w:pPr>
+      <w:r>
+        <w:t>Use atomic launch/charge commit and reserve one shared projectile slot for the full lifecycle. Held inventory does not reserve the active Apex slot; failed activation keeps its charge. Only successful launch starts the global cooldown; removal retains that timestamp; pause freezes it and new race resets it. Generic per-racer immunity blocks blast effects. Shockwave may clear only a diving missile within its 5 m 3D radius, before missile movement/blast in that simulation step. The marked incoming fixture uses normal leader targeting and the same global launch gate. This core increment tests counter boundaries without implementing playable Shockwave/Prismatic; real cross-item and live counter gates remain outstanding. General AI tactics, issue #106, and Slice 6 remain deferred. All other accepted gameplay and probability weights remain unchanged.</w:t>
+      </w:r>
+    </w:p>
+    <w:p>
+      <w:pPr>
+        <w:pStyle w:val="AmendmentHeading"/>
+      </w:pPr>
+      <w:r>
+        <w:t>Amendment 2.8 HazardSystem and Timed Blast Orb</w:t>
+      </w:r>
+    </w:p>
+    <w:p>
+      <w:pPr>
+        <w:pStyle w:val="AmendmentBody"/>
+      </w:pPr>
+      <w:r>
+        <w:t>Approved September 7, 2026. Manny approved the complete bounded docs/SLICE-5-BLAST-ORB-SCOPE.md proposal. Preserve section 15.6 and the approved Slice 5 item-system contract: Timed Blast Orb remains a one-charge forward/backward deployable hazard with an approximately 3.0-second fuse, 4.0 m horizontal blast radius, qualifying early direct-impact detonation, and the approved 1.20-second heavy explosive spinout. Normal rank probabilities remain unchanged.</w:t>
+      </w:r>
+    </w:p>
+    <w:p>
+      <w:pPr>
+        <w:pStyle w:val="AmendmentBody"/>
+      </w:pPr>
+      <w:r>
+        <w:t>The approved implementation establishes HazardSystem as the owner of Blast Orb state, movement, fuse, collision checks, detonation, rendering, counter removal, and cleanup. Item-physics capacity becomes one shared maximum of 40 active/reserved projectile + hazard objects; Kinetic Disc, Seeker Drone, Apex reservations, and Blast Orb each consume one slot for their active lifecycle, and a full-capacity activation must preserve the held charge. Forward deployment spawns approximately 1.75 m ahead at 14 m/s base planar speed plus 0.35x inherited planar owner velocity capped at 12 m/s. Backward deployment spawns approximately 1.75 m behind with 0.20x inherited planar owner velocity capped at 12 m/s. Both use deterministic 6 m/s² planar drag. Guardrails contain the ground-bound orb and remove outward velocity without detonating it.</w:t>
+      </w:r>
+    </w:p>
+    <w:p>
+      <w:pPr>
+        <w:pStyle w:val="AmendmentBody"/>
+      </w:pPr>
+      <w:r>
+        <w:t>Owner immunity lasts 0.35 s. Other racers may trigger a qualifying early detonation during that window, but the owner is excluded from that blast until immunity expires; later armed self-hit/self-blast is legal. Direct racer contact triggers early detonation only at at least 8 m/s planar relative closing speed. Fuse time is race-simulation time and freezes under pause. On each simulation step, queued Shockwave-clear queries resolve before movement/contact and fuse detonation. Blast resolution reuses the generic horizontal area-effect/immunity boundary, applies no extra impulse/damage/speed multiplier, and affects each eligible unfinished racer at most once.</w:t>
+      </w:r>
+    </w:p>
+    <w:p>
+      <w:pPr>
+        <w:pStyle w:val="AmendmentBody"/>
+      </w:pPr>
+      <w:r>
+        <w:t>The reusable hazard counter boundary may remove Blast Orbs within the approved 5 m Shockwave radius, but playable Shockwave and real cross-item counter acceptance remain deferred. AI Blast-Orb/Slick avoidance is also deferred until both shared hazard classes exist. The marked incoming Blast Orb fixture is opt-in and must not consume AI inventory or alter normal item distribution. Issue #106, Slick, Prismatic, general AI item tactics, accepted Nitro/Kinetic/Seeker/Apex behavior, racer stats, track/checkpoint authority, character assets, and Slice 6 remain unchanged/deferred.</w:t>
+      </w:r>
+    </w:p>
+    <w:p>
+      <w:pPr>
+        <w:pStyle w:val="AmendmentHeading"/>
+      </w:pPr>
+      <w:r>
+        <w:t>Amendment 2.9 Slick Trap hazard behavior</w:t>
+      </w:r>
+    </w:p>
+    <w:p>
+      <w:pPr>
+        <w:pStyle w:val="AmendmentBody"/>
+      </w:pPr>
+      <w:r>
+        <w:t>Approved September 7, 2026 before Slick Trap gameplay implementation. The existing Slice 5 roster, rank probabilities, one-slot inventory, accepted Nitro/Kinetic/Seeker/Apex/Blast behavior, track/checkpoint authority, racer statistics, and Slice 6 lock remain unchanged. docs/SLICE-5-SLICK-TRAP-SCOPE.md and ADR-070 are normative for this bounded increment.</w:t>
+      </w:r>
+    </w:p>
+    <w:p>
+      <w:pPr>
+        <w:pStyle w:val="AmendmentBody"/>
+      </w:pPr>
+      <w:r>
+        <w:t>Slick Trap is one charge and extends the accepted HazardSystem. It is rear-only: either forward ITEM intent or Brake/Reverse + ITEM places one stationary Slick approximately 1.75 m behind the kart at track elevation with no inherited planar velocity. Guardrail overlap receives only minimum inward penetration correction. Each active Slick consumes one slot from the accepted shared maximum of 40 active/reserved projectile + hazard objects; capacity failure preserves the held charge.</w:t>
+      </w:r>
+    </w:p>
+    <w:p>
+      <w:pPr>
+        <w:pStyle w:val="AmendmentBody"/>
+      </w:pPr>
+      <w:r>
+        <w:t>A Slick lives for 12 race seconds and freezes under pause. The owner is immune for 0.35 race seconds while other unfinished racers may trigger immediately. After arming, ordinary later owner self-trigger is legal. An unfinished, non-immune racer triggers at planar center distance &lt;= 1.1 m with no closing-speed threshold. The Slick is removed before effect resolution so one placement resolves once. Generic item immunity suppresses the trigger/effect and leaves the Slick in place.</w:t>
+      </w:r>
+    </w:p>
+    <w:p>
+      <w:pPr>
+        <w:pStyle w:val="AmendmentBody"/>
+      </w:pPr>
+      <w:r>
+        <w:t>A valid trigger retains 60% of the racer's current planar velocity without increasing near-stationary speed, applies one 360-degree yaw presentation over 0.85 race seconds, suppresses player drive controls for that presentation, and reuses the accepted perspective-correct hostile-hit camera/driver-state boundary. Do not add the standard/heavy spinout momentum-decay curve, extra impulse, damage, or stacked yaw rate.</w:t>
+      </w:r>
+    </w:p>
+    <w:p>
+      <w:pPr>
+        <w:pStyle w:val="AmendmentBody"/>
+      </w:pPr>
+      <w:r>
+        <w:t>Each owner may have at most two active Slicks. A successful third deployment atomically retires that owner's oldest Slick and replaces it with the new placement; a failed new use preserves the held charge and both existing Slicks. The existing queued hazard-clear boundary applies generically to Slick and Blast Orb and resolves before Slick trigger processing in the same simulation step. Synthetic Shockwave evidence uses the existing approximately 5 m clear radius; playable Shockwave remains deferred.</w:t>
+      </w:r>
+    </w:p>
+    <w:p>
+      <w:pPr>
+        <w:pStyle w:val="AmendmentBody"/>
+      </w:pPr>
+      <w:r>
+        <w:t>Targeted acceptance reuses ?testItem=slick-trap and adds opt-in ?testSlickAhead=1, which places one fixture-owned Slick approximately 8 m ahead after five race seconds without consuming AI inventory or enabling AI tactics/avoidance. AI avoidance for both Blast Orb and Slick remains deferred until Slick itself is live accepted, at which point the shared hazard-response increment is separately approval-gated. Gameplay implementation, publication/deployment, and live acceptance remain separate gates.</w:t>
+      </w:r>
+    </w:p>
+    <w:p>
+      <w:pPr>
+        <w:pStyle w:val="AmendmentHeading"/>
+      </w:pPr>
+      <w:r>
+        <w:t>Amendment 2.10 AI hazard response for Slick Trap and Timed Blast Orb</w:t>
+      </w:r>
+    </w:p>
+    <w:p>
+      <w:pPr>
+        <w:pStyle w:val="AmendmentBody"/>
+      </w:pPr>
+      <w:r>
+        <w:t>Approved September 7, 2026 after live acceptance of both Timed Blast Orb and Slick Trap. This amendment fills the previously unspecified operating details for the existing Section 21.5 AI obstacle-avoidance requirement without enabling AI item acquisition/use, changing accepted hazard physics, altering item probabilities, changing racer statistics, or beginning Slice 6. docs/SLICE-5-AI-HAZARD-RESPONSE-SCOPE.md and ADR-071 are normative for this bounded increment.</w:t>
+      </w:r>
+    </w:p>
+    <w:p>
+      <w:pPr>
+        <w:pStyle w:val="AmendmentBody"/>
+      </w:pPr>
+      <w:r>
+        <w:t>AI hazard awareness consumes read-only Slick Trap and Timed Blast Orb snapshots and reasons by wrapped forward route distance on Circuit Alpha. Relevant hazards are considered up to 20 m ahead. The existing five bounded lane candidates remain authoritative. AI planning treats Slick as conflicted inside a 2.5 m planning footprint and Blast Orb inside a 4.5 m planning footprint; these are decision margins only and do not change the governed Slick trigger or Blast radius. Moving Blast Orbs are evaluated at their current position plus a 0.5 s drag-aware prediction capped by remaining fuse time.</w:t>
+      </w:r>
+    </w:p>
+    <w:p>
+      <w:pPr>
+        <w:pStyle w:val="AmendmentBody"/>
+      </w:pPr>
+      <w:r>
+        <w:t>Hazard clearance takes precedence over preferred-lane convenience while existing nearby-racer avoidance remains active where possible. If every candidate lane is conflicted, AI chooses the candidate with greatest minimum clearance rather than receiving guaranteed immunity. After the last relevant hazard clears or moves behind, AI holds the avoidance lane for at least 0.6 race seconds before normal preferred-lane recovery. All lateral motion continues through existing steering dynamics: no teleport, transform snap, hidden speed boost, speed penalty, emergency brake rule, rubber-band change, or lap/checkpoint mutation is authorized.</w:t>
+      </w:r>
+    </w:p>
+    <w:p>
+      <w:pPr>
+        <w:pStyle w:val="AmendmentBody"/>
+      </w:pPr>
+      <w:r>
+        <w:t>Awareness timers advance only with race simulation, so pause freezes the clear-hold. Removed/expired hazards disappear from awareness on the next simulation step; restart, return-to-hub, and disposal clear temporary avoidance state. Deterministic acceptance instrumentation may use ?testAiHazardAvoidance=slick and ?testAiHazardAvoidance=blast to place a real accepted hazard approximately 12 m ahead of the first unfinished AI after five race seconds without consuming AI inventory or enabling AI item tactics. Gameplay implementation, publication/deployment, and live acceptance remain separately gated.</w:t>
+      </w:r>
+    </w:p>
+    <w:p>
+      <w:pPr>
+        <w:pStyle w:val="AmendmentHeading"/>
+      </w:pPr>
+      <w:r>
+        <w:t>Amendment 2.11 Acoustic Shockwave Pulse counter behavior</w:t>
+      </w:r>
+    </w:p>
+    <w:p>
+      <w:pPr>
+        <w:pStyle w:val="AmendmentBody"/>
+      </w:pPr>
+      <w:r>
+        <w:t>Approved September 7, 2026 before Shockwave gameplay implementation. This amendment fills the operating details for the existing Section 15.12 Acoustic Shockwave Pulse without changing its approximately 5 m radial-defense identity, the fifteen-item probability matrix, one-slot inventory, racer statistics, track/checkpoint authority, accepted item behavior, or the Slice 6 lock. docs/SLICE-5-SHOCKWAVE-SCOPE.md and ADR-072 are normative for this bounded increment.</w:t>
+      </w:r>
+    </w:p>
+    <w:p>
+      <w:pPr>
+        <w:pStyle w:val="AmendmentBody"/>
+      </w:pPr>
+      <w:r>
+        <w:t>Shockwave is a one-charge instantaneous pulse centered on the using kart. Forward and backward ITEM intent are equivalent. A successful activation consumes its charge when the pulse is committed even if no target is inside the radius. Shockwave itself is not a persistent projectile/hazard and does not reserve a shared item-physics-capacity slot. The readable expanding pressure-ring presentation is gameplay VFX only; final production VFX/audio remains Slice 6.</w:t>
+      </w:r>
+    </w:p>
+    <w:p>
+      <w:pPr>
+        <w:pStyle w:val="AmendmentBody"/>
+      </w:pPr>
+      <w:r>
+        <w:t>Eligible unfinished, non-owner, non-immune racers at horizontal center distance &lt;= 5.0 m receive no conventional spinout, damage, teleport, or transform snap. Instead the pulse adds one outward planar velocity delta with magnitude linearly interpolated from 6.0 m/s at zero distance to 2.0 m/s at 5.0 m. A deterministic finite fallback direction is required for coincident centers. The effect may not edit lap/checkpoint/rank/finish authority.</w:t>
+      </w:r>
+    </w:p>
+    <w:p>
+      <w:pPr>
+        <w:pStyle w:val="AmendmentBody"/>
+      </w:pPr>
+      <w:r>
+        <w:t>Within the same 5.0 m horizontal radius, ordinary active Ricochet Kinetic Disc and Homing Seeker Drone projectiles are destroyed regardless of their owner-arming state. Slick Trap and Timed Blast Orb hazards are cleared through the accepted queued HazardSystem counter boundary. The existing Apex counter remains 3D: only a missile already in its terminal/dive state may be neutralized inside 5.0 m; rise, sky-travel, and warning/overhead phases are not counterable. Counter queries must resolve before affected projectile/hazard/Apex movement, contact, fuse, or blast processing in that simulation step so a correctly timed pulse wins the frame.</w:t>
+      </w:r>
+    </w:p>
+    <w:p>
+      <w:pPr>
+        <w:pStyle w:val="AmendmentBody"/>
+      </w:pPr>
+      <w:r>
+        <w:t>No AI item acquisition/use is enabled by this increment. The player-only ?testItem=shockwave override and bounded ?testShockwaveCounter=&lt;case&gt; acceptance fixtures may exercise racer, Kinetic, Seeker, Slick, Blast, and terminal-Apex cases without altering normal distribution or AI tactics. Pause/restart/disposal must leave no queued pulse or presentation state behind. Gameplay implementation, publication/deployment, and live acceptance remain separately gated.</w:t>
+      </w:r>
+    </w:p>
+    <w:p>
+      <w:pPr>
+        <w:pStyle w:val="AmendmentHeading"/>
+      </w:pPr>
+      <w:r>
+        <w:t>Amendment 2.12 Prismatic Invincibility</w:t>
+      </w:r>
+    </w:p>
+    <w:p>
+      <w:pPr>
+        <w:pStyle w:val="AmendmentBody"/>
+      </w:pPr>
+      <w:r>
+        <w:t>Approved September 9, 2026, including Manny's explicit clarification that Prismatic prevents Slick spinout and dirt/grass slowdown. Section 15.17, ADR-073, and docs/SLICE-5-PRISMATIC-INVINCIBILITY-SCOPE.md govern this bounded increment.</w:t>
+      </w:r>
+    </w:p>
+    <w:p>
+      <w:pPr>
+        <w:pStyle w:val="AmendmentBody"/>
+      </w:pPr>
+      <w:r>
+        <w:t>A valid committed one-charge use frees the inventory slot and activates exactly 6.0 race seconds of item immunity, a 1.12x road-based speed cap, and hostile contact. Forward/reverse ITEM are equivalent. A repeat use refreshes duration rather than stacking. Ignore dirt/grass speed-cap, deceleration, and acceleration penalties while active; retain terrain geometry and steering/traction. Use normal acceleration, with no instantaneous speed multiplication or autopilot. Preserve independently timed Nitro and other accepted boosts; combine caps and acceleration by maximum, never multiplication. Activation does not clear an existing spinout or restore lost momentum.</w:t>
+      </w:r>
+    </w:p>
+    <w:p>
+      <w:pPr>
+        <w:pStyle w:val="AmendmentBody"/>
+      </w:pPr>
+      <w:r>
+        <w:t>Valid armed Kinetic/Seeker contacts are absorbed, destroying the projectile without a hostile effect on the protected racer. Protected racers do not trigger or clear Slick and receive no spinout or speed reduction. Blast/Apex keep normal contact/fuse/targeting/explosion resolution, excluding protected victims while still affecting eligible others. Shockwave cannot push protected racers. Ordinary weight-based kart contact and guardrail physics remain active.</w:t>
+      </w:r>
+    </w:p>
+    <w:p>
+      <w:pPr>
+        <w:pStyle w:val="AmendmentBody"/>
+      </w:pPr>
+      <w:r>
+        <w:t>Hostile contact applies one 0.85-second, one-turn standard spin per encounter to an unfinished non-immune rival at the existing planar contact distance &lt; 2.35 m. Sustained overlap cannot repeatedly refresh the spin; separation to &gt;= 2.35 m rearms the pair. Two protected racers cannot spin one another. No additional speed-retention penalty, contact radius, teleport, heading snap, or race-progress mutation is introduced.</w:t>
+      </w:r>
+    </w:p>
+    <w:p>
+      <w:pPr>
+        <w:pStyle w:val="AmendmentBody"/>
+      </w:pPr>
+      <w:r>
+        <w:t>The approved readable presentation is a translucent faceted shell that follows kart/driver through turns and jumps; flowing cyan/violet/pink/gold highlights with a gentle pulse; a short fading particle trail; a brief blocked-item shimmer; a separate active countdown; and an original volume-aware musical layer. The final second fades smoothly without rapid flashing or a full-screen wash. Preserve driver, track, and hazard visibility. Pause freezes the state; expiry removes only this effect's contributions. Finish, recovery/respawn, restart, hub return, and disposal clear it. Drive, contact, and projectile/hazard processing must use a consistent active interval, including exact activation/expiry boundaries.</w:t>
+      </w:r>
+    </w:p>
+    <w:p>
+      <w:pPr>
+        <w:pStyle w:val="AmendmentBody"/>
+      </w:pPr>
+      <w:r>
+        <w:t>The approved scope specifies fixed-item, held-ready, protected/expired acceptance fixtures with visible stages and verified encounters. The query names are not deployed until gameplay publication. No probability, accepted item balance, racer-stat, track/checkpoint, dependency, AI acquisition/use, or Slice 6 change is authorized. Governance publication, gameplay publication, and product-owner live acceptance retain their separate gates.</w:t>
+      </w:r>
+    </w:p>
+    <w:p>
+      <w:pPr>
+        <w:pStyle w:val="AmendmentHeading"/>
+      </w:pPr>
+      <w:r>
+        <w:t>Amendment 2.13 Blaze Orbs</w:t>
+      </w:r>
+    </w:p>
+    <w:p>
+      <w:pPr>
+        <w:pStyle w:val="AmendmentBody"/>
+      </w:pPr>
+      <w:r>
+        <w:t>Manny approved the complete Blaze Orbs scope in Work following Prismatic live acceptance. Section 15.7, ADR-074, and docs/SLICE-5-BLAZE-ORBS-SCOPE.md are normative. Preserve five charges, at least 0.55 race seconds between committed shots, and a 0.55-second short spin per valid hit.</w:t>
+      </w:r>
+    </w:p>
+    <w:p>
+      <w:pPr>
+        <w:pStyle w:val="AmendmentBody"/>
+      </w:pPr>
+      <w:r>
+        <w:t>Each ITEM press launches one straight planar orb forward, or backward with Brake/Reverse. No automatic fire or target requirement. Use 42 m/s with no inherited kart velocity, 0.28 m radius, a 3.0-second lifetime, zero wall bounces, and 0.18-second owner immunity. Use the shared launch offset of 1.75 m plus radius, shared projectile height/terrain conventions, and existing 1.05 m racer collision radius. Other racers can be hit during owner arming; later normal contact may hit the owner. Destroy on first guardrail or valid racer contact. No splash, burning, extra speed-retention penalty, or damage-over-time. Repeated hits refresh the accepted short spin, without adding duration or spin rates.</w:t>
+      </w:r>
+    </w:p>
+    <w:p>
+      <w:pPr>
+        <w:pStyle w:val="AmendmentBody"/>
+      </w:pPr>
+      <w:r>
+        <w:t>The first shot is immediately eligible; only a committed shot spends a charge and starts cadence. Rejection or full shared capacity retains the charge; failed transactions release reservations. The fifth shot frees the slot. Each orb uses one existing shared 40-object slot. Pause freezes cadence, movement, arming, and lifetime. Fired orbs retain ordinary projectile lifetime after owner finish; restart/disposal cleans all owned state.</w:t>
+      </w:r>
+    </w:p>
+    <w:p>
+      <w:pPr>
+        <w:pStyle w:val="AmendmentBody"/>
+      </w:pPr>
+      <w:r>
+        <w:t>Prismatic or another active generic immunity source absorbs valid contact without hostile spin or hit sprite and releases projectile capacity. Shockwave destroys Blaze within its existing &lt;=5 m horizontal counter radius before same-step movement/contact. Preserve accepted immunity timing and target snapshot refresh.</w:t>
+      </w:r>
+    </w:p>
+    <w:p>
+      <w:pPr>
+        <w:pStyle w:val="AmendmentBody"/>
+      </w:pPr>
+      <w:r>
+        <w:t>Use an original amber-orange energy orb, hot core, short ember trail, finite sparks and short gesture/volume/pause-safe audio with bounded resources and both-camera readability. Approved fixed-item hit, Shockwave counter, and Prismatic protected/expired fixtures must report actual verified encounters; misses/interceptions do not count as success. Full details and test gates are in the scope and TESTING.md.</w:t>
+      </w:r>
+    </w:p>
+    <w:p>
+      <w:pPr>
+        <w:pStyle w:val="AmendmentBody"/>
+      </w:pPr>
+      <w:r>
+        <w:t>No other item tuning, probabilities, racer stats, race authority, dependencies, AI item tactics, or Slice 6 expansion is authorized. Governance publication, gameplay publication, and live acceptance remain separate gates.</w:t>
+      </w:r>
+    </w:p>
+    <w:p>
+      <w:pPr>
+        <w:pStyle w:val="AmendmentHeading"/>
+      </w:pPr>
+      <w:r>
+        <w:t>Amendment 2.14 Frost Orbs stacked momentum and handling impairment</w:t>
+      </w:r>
+    </w:p>
+    <w:p>
+      <w:pPr>
+        <w:pStyle w:val="AmendmentBody"/>
+      </w:pPr>
+      <w:r>
+        <w:t>Manny approved the complete Frost Orbs scope in Work following Blaze live acceptance. Section 15.8, ADR-075, and docs/SLICE-5-FROST-ORBS-SCOPE.md are normative. Preserve three charges and the existing ordinary-projectile/inventory, Prismatic, Shockwave, race-authority, AI, dependency, and Slice 6 boundaries.</w:t>
+      </w:r>
+    </w:p>
+    <w:p>
+      <w:pPr>
+        <w:pStyle w:val="AmendmentBody"/>
+      </w:pPr>
+      <w:r>
+        <w:t>A valid Frost hit multiplies the affected racer's current planar X/Z velocity by 0.55 and applies one 0.80 steering-authority multiplier for 1.2 race seconds. Each subsequent valid hit while Frost is active adds another stack, multiplies the current planar X/Z velocity by 0.55 again, applies another 0.80 steering multiplier, and resets the shared 1.2-second timer. All active stacks expire together from the latest hit. Preserve Y velocity, heading, position, race progress, normal acceleration, drift inputs/charge, traction/grip, stats, and AI path decisions. Frost never adds spin, full freeze, extra speed cap, acceleration penalty, or momentum restoration on expiry.</w:t>
+      </w:r>
+    </w:p>
+    <w:p>
+      <w:pPr>
+        <w:pStyle w:val="AmendmentBody"/>
+      </w:pPr>
+      <w:r>
+        <w:t>Use the approved Frost flight, arming, cadence, collision, counter, immunity, lifecycle, presentation, and deterministic-fixture boundaries in the scope document. No other item tuning, probabilities, racer stats, race authority, dependencies, AI item tactics, or Slice 6 work is authorized. Governance publication, gameplay publication, and live acceptance remain separate gates.</w:t>
+      </w:r>
+    </w:p>
+    <w:p>
+      <w:pPr>
+        <w:pStyle w:val="AmendmentHeading"/>
+      </w:pPr>
+      <w:r>
+        <w:t>Amendment 2.15 Rebounding Arc Blade</w:t>
+      </w:r>
+    </w:p>
+    <w:p>
+      <w:pPr>
+        <w:pStyle w:val="AmendmentBody"/>
+      </w:pPr>
+      <w:r>
+        <w:t>Manny approved the complete scope and its governance publication in Work on September 11, 2026, following Frost live acceptance. docs/SLICE-5-ARC-BLADE-SCOPE.md and ADR-076 govern the bounded increment. Preserve section 15.9's three charges, forward curved throw, return to owner, and once-per-rival-per-leg hit limit. Approved fill-ins are 0.55-second cadence, 42 m/s outbound travel, 30 m forward range with a 2 m rightward bow, 56 m/s direct return pursuit, 0.32 m radius, 0.18-second owner arming, and a four-second total lifetime. First guardrail contact destroys the blade; ordinary rival hits use the accepted 0.85-second spin and do not end the flight.</w:t>
+      </w:r>
+    </w:p>
+    <w:p>
+      <w:pPr>
+        <w:pStyle w:val="AmendmentBody"/>
+      </w:pPr>
+      <w:r>
+        <w:t>The approved safe return catch gives no charge refund and explicitly excepts returning Arc owner contact from amendment 2.2's generic self-hit rule. Armed outbound owner contact remains eligible. A phase change during continuous overlap cannot cause a second hit until separation. Owner recovery/finish/removal cancels its blades. Prismatic absorption, Shockwave's &lt;=5 m horizontal clear priority, independent effect ownership, shared capacity, rollback, and normal race authority remain in force.</w:t>
+      </w:r>
+    </w:p>
+    <w:p>
+      <w:pPr>
+        <w:pStyle w:val="AmendmentBody"/>
+      </w:pPr>
+      <w:r>
+        <w:t>The primary test route will force Arc pickups while preserving unrestricted normal-race input. The scope document specifies the exact geometry, lifecycle, presentation and automated/live gates. This governance checkpoint changes no gameplay. No probability, dependency, AI item-use, other item balance or Slice 6 change is authorized. Verify governance merge and CI/Pages before the separately authorized gameplay increment; gameplay publication and live acceptance remain later gates.</w:t>
       </w:r>
     </w:p>
     <w:sectPr>
@@ -37317,6 +37818,34 @@
       <w:sz w:val="16"/>
     </w:rPr>
   </w:style>
+  <w:style w:type="paragraph" w:customStyle="1" w:styleId="AmendmentBody">
+    <w:name w:val="Amendment Body"/>
+    <w:basedOn w:val="Normal"/>
+    <w:pPr>
+      <w:widowControl/>
+      <w:spacing w:after="140" w:line="259" w:lineRule="auto"/>
+    </w:pPr>
+    <w:rPr>
+      <w:rFonts w:ascii="Calibri" w:hAnsi="Calibri"/>
+      <w:color w:val="000000"/>
+      <w:sz w:val="22"/>
+    </w:rPr>
+  </w:style>
+  <w:style w:type="paragraph" w:customStyle="1" w:styleId="AmendmentHeading">
+    <w:name w:val="Amendment Heading"/>
+    <w:basedOn w:val="Normal"/>
+    <w:pPr>
+      <w:keepNext/>
+      <w:widowControl/>
+      <w:spacing w:after="140" w:line="259" w:lineRule="auto" w:before="240"/>
+    </w:pPr>
+    <w:rPr>
+      <w:rFonts w:ascii="Calibri" w:hAnsi="Calibri"/>
+      <w:b/>
+      <w:color w:val="000000"/>
+      <w:sz w:val="26"/>
+    </w:rPr>
+  </w:style>
 </w:styles>
 </file>
 

</xml_diff>

<commit_message>
Publish approved Arc Hammers governance docs
</commit_message>
<xml_diff>
--- a/docs/Manacondas_Minigame_Mayhem_PRD_v1.1.docx
+++ b/docs/Manacondas_Minigame_Mayhem_PRD_v1.1.docx
@@ -25231,7 +25231,7 @@
         <w:pStyle w:val="AmendmentBody"/>
       </w:pPr>
       <w:r>
-        <w:t>This appendix records the approved working PRD amendments 2.3 through 2.15. They supersede corresponding earlier baseline clauses. Amendment 2.15 records Manny's September 11, 2026 approval of Rebounding Arc Blade scope and governance publication. Gameplay implementation and live acceptance remain subsequent gates. The canonical working text and the referenced scope documents are maintained in docs/PRD.md in Manaconda33/manacondas-minigame-mayhem.</w:t>
+        <w:t>This appendix records the approved working PRD amendments 2.3 through 2.16. They supersede corresponding earlier baseline clauses. Amendment 2.15 records Manny's September 11, 2026 approval of Rebounding Arc Blade scope/governance, which is now live accepted. Amendment 2.16 records Manny's September 16, 2026 approval of Kinetic Arc Hammers scope while explicitly withholding gameplay and asset/presentation development. The canonical working text and referenced scope documents are maintained in docs/PRD.md in Manaconda33/manacondas-minigame-mayhem.</w:t>
       </w:r>
     </w:p>
     <w:p>
@@ -25712,6 +25712,54 @@
       </w:pPr>
       <w:r>
         <w:t>The primary test route will force Arc pickups while preserving unrestricted normal-race input. The scope document specifies the exact geometry, lifecycle, presentation and automated/live gates. This governance checkpoint changes no gameplay. No probability, dependency, AI item-use, other item balance or Slice 6 change is authorized. Verify governance merge and CI/Pages before the separately authorized gameplay increment; gameplay publication and live acceptance remain later gates.</w:t>
+      </w:r>
+    </w:p>
+    <w:p>
+      <w:pPr>
+        <w:pStyle w:val="AmendmentHeading"/>
+      </w:pPr>
+      <w:r>
+        <w:t>Amendment 2.16 Kinetic Arc Hammers</w:t>
+      </w:r>
+    </w:p>
+    <w:p>
+      <w:pPr>
+        <w:pStyle w:val="AmendmentBody"/>
+      </w:pPr>
+      <w:r>
+        <w:t>Approved September 16, 2026 after Rebounding Arc Blade live acceptance. docs/SLICE-5-ARC-HAMMERS-SCOPE.md and ADR-077 govern this bounded increment. Preserve Section 15.10's five charges, minimum 0.35 race-second cadence, ballistic trajectories, exactly one terrain bounce, short post-bounce expiry, and the existing standard 0.85-second racer spin. Manny approved the complete operating contract while explicitly withholding gameplay implementation and asset/presentation development.</w:t>
+      </w:r>
+    </w:p>
+    <w:p>
+      <w:pPr>
+        <w:pStyle w:val="AmendmentBody"/>
+      </w:pPr>
+      <w:r>
+        <w:t>One ITEM press throws one Hammer. Normal ITEM throws forward; Brake/Reverse + ITEM throws backward. The first throw is immediately eligible and only a committed use spends a charge or starts cadence. Launch uses 36 m/s horizontal base speed plus 0.20 times the owner's planar launch velocity after a 10 m/s pre-scale cap, 11 m/s initial upward velocity, 24 m/s^2 downward gravity, 0.36 m contact radius, the existing 1.75 m plus radius launch offset, and 0.18 race seconds of owner arming. After arming, normal later owner self-hit is legal.</w:t>
+      </w:r>
+    </w:p>
+    <w:p>
+      <w:pPr>
+        <w:pStyle w:val="AmendmentBody"/>
+      </w:pPr>
+      <w:r>
+        <w:t>The first genuine descending contact with the actual supporting Circuit Alpha surface is the single terrain bounce. Retain 0.78 times tangential velocity and reflect the incoming surface-normal component at 0.55 restitution; asphalt, dirt, grass, boost and ramp surfaces use the same Hammer bounce physics. First guardrail contact destroys the Hammer and never counts as its terrain bounce. On the first terrain bounce, cap remaining lifetime to 0.75 race seconds; the next genuine terrain contact destroys it. A Hammer that never bounces has a 2.25 race-second hard lifetime. Resolve swept contacts chronologically, with same-time priority guardrail, then eligible racer, then terrain.</w:t>
+      </w:r>
+    </w:p>
+    <w:p>
+      <w:pPr>
+        <w:pStyle w:val="AmendmentBody"/>
+      </w:pPr>
+      <w:r>
+        <w:t>The first eligible racer hit applies the accepted 0.85-second standard spin through existing RacerEffects/camera/driver-state authority and destroys the Hammer, with no piercing, AoE, extra velocity penalty, Frost stack, or race-progress mutation. Generic immunity and Prismatic absorb and destroy the Hammer without a hostile effect. Shockwave clears an active Hammer at horizontal distance less than or equal to 5 m before same-step Hammer movement, bounce, or racer contact. Each active Hammer owns one existing shared 40-object item-physics slot; pause freezes all Hammer timing/motion/presentation state; owner recovery or finish does not cancel an already-fired Hammer; restart, hub return, and disposal clear it.</w:t>
+      </w:r>
+    </w:p>
+    <w:p>
+      <w:pPr>
+        <w:pStyle w:val="AmendmentBody"/>
+      </w:pPr>
+      <w:r>
+        <w:t>The approved original procedural Hammer presentation and fixed-item/counter acceptance routes are future implementation contracts only. No model, VFX, audio, binary asset, or gameplay development is authorized by this governance checkpoint. No item probability, accepted-item tuning, racer statistic, track/checkpoint authority, AI item policy, dependency, or Slice 6 requirement changes.</w:t>
       </w:r>
     </w:p>
     <w:sectPr>

</xml_diff>

<commit_message>
Publish approved Kinetic Arc Hammers governance
Publish amendment 2.16 / ADR-077 and the approved Kinetic Arc Hammers scope. Synchronize the Markdown and Word PRD governance records while explicitly keeping gameplay implementation and asset/presentation development unauthorized.
</commit_message>
<xml_diff>
--- a/docs/Manacondas_Minigame_Mayhem_PRD_v1.1.docx
+++ b/docs/Manacondas_Minigame_Mayhem_PRD_v1.1.docx
@@ -25231,7 +25231,7 @@
         <w:pStyle w:val="AmendmentBody"/>
       </w:pPr>
       <w:r>
-        <w:t>This appendix records the approved working PRD amendments 2.3 through 2.15. They supersede corresponding earlier baseline clauses. Amendment 2.15 records Manny's September 11, 2026 approval of Rebounding Arc Blade scope and governance publication. Gameplay implementation and live acceptance remain subsequent gates. The canonical working text and the referenced scope documents are maintained in docs/PRD.md in Manaconda33/manacondas-minigame-mayhem.</w:t>
+        <w:t>This appendix records the approved working PRD amendments 2.3 through 2.16. They supersede corresponding earlier baseline clauses. Amendment 2.15 records Manny's September 11, 2026 approval of Rebounding Arc Blade scope/governance, which is now live accepted. Amendment 2.16 records Manny's September 16, 2026 approval of Kinetic Arc Hammers scope while explicitly withholding gameplay and asset/presentation development. The canonical working text and referenced scope documents are maintained in docs/PRD.md in Manaconda33/manacondas-minigame-mayhem.</w:t>
       </w:r>
     </w:p>
     <w:p>
@@ -25712,6 +25712,54 @@
       </w:pPr>
       <w:r>
         <w:t>The primary test route will force Arc pickups while preserving unrestricted normal-race input. The scope document specifies the exact geometry, lifecycle, presentation and automated/live gates. This governance checkpoint changes no gameplay. No probability, dependency, AI item-use, other item balance or Slice 6 change is authorized. Verify governance merge and CI/Pages before the separately authorized gameplay increment; gameplay publication and live acceptance remain later gates.</w:t>
+      </w:r>
+    </w:p>
+    <w:p>
+      <w:pPr>
+        <w:pStyle w:val="AmendmentHeading"/>
+      </w:pPr>
+      <w:r>
+        <w:t>Amendment 2.16 Kinetic Arc Hammers</w:t>
+      </w:r>
+    </w:p>
+    <w:p>
+      <w:pPr>
+        <w:pStyle w:val="AmendmentBody"/>
+      </w:pPr>
+      <w:r>
+        <w:t>Approved September 16, 2026 after Rebounding Arc Blade live acceptance. docs/SLICE-5-ARC-HAMMERS-SCOPE.md and ADR-077 govern this bounded increment. Preserve Section 15.10's five charges, minimum 0.35 race-second cadence, ballistic trajectories, exactly one terrain bounce, short post-bounce expiry, and the existing standard 0.85-second racer spin. Manny approved the complete operating contract while explicitly withholding gameplay implementation and asset/presentation development.</w:t>
+      </w:r>
+    </w:p>
+    <w:p>
+      <w:pPr>
+        <w:pStyle w:val="AmendmentBody"/>
+      </w:pPr>
+      <w:r>
+        <w:t>One ITEM press throws one Hammer. Normal ITEM throws forward; Brake/Reverse + ITEM throws backward. The first throw is immediately eligible and only a committed use spends a charge or starts cadence. Launch uses 36 m/s horizontal base speed plus 0.20 times the owner's planar launch velocity after a 10 m/s pre-scale cap, 11 m/s initial upward velocity, 24 m/s^2 downward gravity, 0.36 m contact radius, the existing 1.75 m plus radius launch offset, and 0.18 race seconds of owner arming. After arming, normal later owner self-hit is legal.</w:t>
+      </w:r>
+    </w:p>
+    <w:p>
+      <w:pPr>
+        <w:pStyle w:val="AmendmentBody"/>
+      </w:pPr>
+      <w:r>
+        <w:t>The first genuine descending contact with the actual supporting Circuit Alpha surface is the single terrain bounce. Retain 0.78 times tangential velocity and reflect the incoming surface-normal component at 0.55 restitution; asphalt, dirt, grass, boost and ramp surfaces use the same Hammer bounce physics. First guardrail contact destroys the Hammer and never counts as its terrain bounce. On the first terrain bounce, cap remaining lifetime to 0.75 race seconds; the next genuine terrain contact destroys it. A Hammer that never bounces has a 2.25 race-second hard lifetime. Resolve swept contacts chronologically, with same-time priority guardrail, then eligible racer, then terrain.</w:t>
+      </w:r>
+    </w:p>
+    <w:p>
+      <w:pPr>
+        <w:pStyle w:val="AmendmentBody"/>
+      </w:pPr>
+      <w:r>
+        <w:t>The first eligible racer hit applies the accepted 0.85-second standard spin through existing RacerEffects/camera/driver-state authority and destroys the Hammer, with no piercing, AoE, extra velocity penalty, Frost stack, or race-progress mutation. Generic immunity and Prismatic absorb and destroy the Hammer without a hostile effect. Shockwave clears an active Hammer at horizontal distance less than or equal to 5 m before same-step Hammer movement, bounce, or racer contact. Each active Hammer owns one existing shared 40-object item-physics slot; pause freezes all Hammer timing/motion/presentation state; owner recovery or finish does not cancel an already-fired Hammer; restart, hub return, and disposal clear it.</w:t>
+      </w:r>
+    </w:p>
+    <w:p>
+      <w:pPr>
+        <w:pStyle w:val="AmendmentBody"/>
+      </w:pPr>
+      <w:r>
+        <w:t>The approved original procedural Hammer presentation and fixed-item/counter acceptance routes are future implementation contracts only. No model, VFX, audio, binary asset, or gameplay development is authorized by this governance checkpoint. No item probability, accepted-item tuning, racer statistic, track/checkpoint authority, AI item policy, dependency, or Slice 6 requirement changes.</w:t>
       </w:r>
     </w:p>
     <w:sectPr>

</xml_diff>